<commit_message>
checked and filtered mRNA data
</commit_message>
<xml_diff>
--- a/data/miRNA_mRNA_Project_Week1.docx
+++ b/data/miRNA_mRNA_Project_Week1.docx
@@ -15,25 +15,7 @@
           <w:color w:val="000000"/>
           <w:sz w:val="46"/>
         </w:rPr>
-        <w:t xml:space="preserve">Week 1: miRNA-mRNA </w:t>
-      </w:r>
-      <w:r>
-        <w:rPr>
-          <w:rFonts w:ascii="Arial" w:hAnsi="Arial"/>
-          <w:b/>
-          <w:color w:val="000000"/>
-          <w:sz w:val="46"/>
-        </w:rPr>
-        <w:t xml:space="preserve">human – chimp </w:t>
-      </w:r>
-      <w:r>
-        <w:rPr>
-          <w:rFonts w:ascii="Arial" w:hAnsi="Arial"/>
-          <w:b/>
-          <w:color w:val="000000"/>
-          <w:sz w:val="46"/>
-        </w:rPr>
-        <w:t xml:space="preserve">brain development </w:t>
+        <w:t xml:space="preserve">Week 1: miRNA-mRNA human – chimp brain development </w:t>
       </w:r>
     </w:p>
     <w:p>
@@ -421,7 +403,17 @@
                 <w:color w:val="000000"/>
                 <w:sz w:val="19"/>
               </w:rPr>
-              <w:t>22</w:t>
+              <w:t>2</w:t>
+            </w:r>
+            <w:r>
+              <w:rPr>
+                <w:rFonts w:ascii="Liberation Sans" w:hAnsi="Liberation Sans"/>
+                <w:b w:val="false"/>
+                <w:i w:val="false"/>
+                <w:color w:val="000000"/>
+                <w:sz w:val="19"/>
+              </w:rPr>
+              <w:t>3</w:t>
             </w:r>
           </w:p>
         </w:tc>
@@ -483,7 +475,17 @@
                 <w:color w:val="000000"/>
                 <w:sz w:val="19"/>
               </w:rPr>
-              <w:t>24</w:t>
+              <w:t>2</w:t>
+            </w:r>
+            <w:r>
+              <w:rPr>
+                <w:rFonts w:ascii="Liberation Sans" w:hAnsi="Liberation Sans"/>
+                <w:b w:val="false"/>
+                <w:i w:val="false"/>
+                <w:color w:val="000000"/>
+                <w:sz w:val="19"/>
+              </w:rPr>
+              <w:t>6</w:t>
             </w:r>
           </w:p>
         </w:tc>
@@ -514,7 +516,7 @@
                 <w:color w:val="000000"/>
                 <w:sz w:val="19"/>
               </w:rPr>
-              <w:t>58</w:t>
+              <w:t>61</w:t>
             </w:r>
           </w:p>
         </w:tc>
@@ -1393,6 +1395,94 @@
     </w:p>
     <w:p>
       <w:pPr>
+        <w:pStyle w:val="Normal"/>
+        <w:rPr>
+          <w:color w:val="000000"/>
+          <w:sz w:val="21"/>
+        </w:rPr>
+      </w:pPr>
+      <w:r>
+        <w:rPr/>
+      </w:r>
+    </w:p>
+    <w:p>
+      <w:pPr>
+        <w:pStyle w:val="Normal"/>
+        <w:rPr>
+          <w:b/>
+          <w:bCs/>
+        </w:rPr>
+      </w:pPr>
+      <w:r>
+        <w:rPr>
+          <w:b/>
+          <w:bCs/>
+          <w:color w:val="000000"/>
+          <w:sz w:val="21"/>
+        </w:rPr>
+        <w:t xml:space="preserve">Data files: </w:t>
+      </w:r>
+    </w:p>
+    <w:p>
+      <w:pPr>
+        <w:pStyle w:val="BodyText"/>
+        <w:numPr>
+          <w:ilvl w:val="0"/>
+          <w:numId w:val="9"/>
+        </w:numPr>
+        <w:tabs>
+          <w:tab w:val="clear" w:pos="720"/>
+          <w:tab w:val="left" w:pos="0" w:leader="none"/>
+        </w:tabs>
+        <w:bidi w:val="0"/>
+        <w:spacing w:before="0" w:after="0"/>
+        <w:ind w:hanging="283" w:left="720" w:right="0"/>
+        <w:rPr/>
+      </w:pPr>
+      <w:r>
+        <w:rPr>
+          <w:rStyle w:val="SourceText"/>
+          <w:color w:val="000000"/>
+          <w:sz w:val="21"/>
+        </w:rPr>
+        <w:t>series_matrix.txt.gz</w:t>
+      </w:r>
+      <w:r>
+        <w:rPr>
+          <w:color w:val="000000"/>
+          <w:sz w:val="21"/>
+        </w:rPr>
+        <w:t xml:space="preserve"> =  expression matrix;</w:t>
+      </w:r>
+    </w:p>
+    <w:p>
+      <w:pPr>
+        <w:pStyle w:val="BodyText"/>
+        <w:numPr>
+          <w:ilvl w:val="0"/>
+          <w:numId w:val="10"/>
+        </w:numPr>
+        <w:tabs>
+          <w:tab w:val="clear" w:pos="720"/>
+          <w:tab w:val="left" w:pos="0" w:leader="none"/>
+        </w:tabs>
+        <w:bidi w:val="0"/>
+        <w:ind w:hanging="283" w:left="720" w:right="0"/>
+        <w:rPr/>
+      </w:pPr>
+      <w:r>
+        <w:rPr>
+          <w:rStyle w:val="SourceText"/>
+        </w:rPr>
+        <w:t>family.soft.gz</w:t>
+      </w:r>
+      <w:r>
+        <w:rPr/>
+        <w:t xml:space="preserve"> = detailed metadata and documentation, sometimes including another representation of the processed values;</w:t>
+      </w:r>
+    </w:p>
+    <w:p>
+      <w:pPr>
         <w:pStyle w:val="Heading1"/>
         <w:rPr/>
       </w:pPr>
@@ -1492,7 +1582,10 @@
         </w:rPr>
       </w:pPr>
       <w:r>
-        <w:rPr/>
+        <w:rPr>
+          <w:color w:val="000000"/>
+          <w:sz w:val="21"/>
+        </w:rPr>
       </w:r>
     </w:p>
     <w:p>
@@ -1570,15 +1663,7 @@
       </w:r>
       <w:r>
         <w:rPr/>
-        <w:t xml:space="preserve"> </w:t>
-      </w:r>
-      <w:r>
-        <w:rPr/>
-        <w:t>For debugging only. V</w:t>
-      </w:r>
-      <w:r>
-        <w:rPr/>
-        <w:t xml:space="preserve">erify the pipeline using all 26 individuals but fewer molecular features. </w:t>
+        <w:t xml:space="preserve"> For debugging only. Verify the pipeline using all 26 individuals but fewer molecular features. </w:t>
       </w:r>
       <w:r>
         <w:rPr>
@@ -1607,7 +1692,10 @@
         </w:rPr>
       </w:pPr>
       <w:r>
-        <w:rPr/>
+        <w:rPr>
+          <w:color w:val="000000"/>
+          <w:sz w:val="21"/>
+        </w:rPr>
       </w:r>
     </w:p>
     <w:p>
@@ -1706,13 +1794,130 @@
           <w:color w:val="000000"/>
           <w:sz w:val="18"/>
         </w:rPr>
-        <w:t>5.  TargetScanHuman Release 8.0 data download. https://www.targetscan.org/cgi-bin/targetscan/data_download.vert80.cgi</w:t>
+        <w:t xml:space="preserve">5.  TargetScanHuman Release 8.0 data download. </w:t>
+      </w:r>
+      <w:hyperlink r:id="rId3">
+        <w:r>
+          <w:rPr>
+            <w:rStyle w:val="Hyperlink"/>
+            <w:color w:val="000000"/>
+            <w:sz w:val="18"/>
+          </w:rPr>
+          <w:t>https://www.targetscan.org/cgi-bin/targetscan/data_download.vert80.cgi</w:t>
+        </w:r>
+      </w:hyperlink>
+    </w:p>
+    <w:p>
+      <w:pPr>
+        <w:pStyle w:val="Normal"/>
+        <w:spacing w:before="0" w:after="60"/>
+        <w:ind w:hanging="317" w:left="317"/>
+        <w:rPr>
+          <w:color w:val="000000"/>
+          <w:sz w:val="18"/>
+        </w:rPr>
+      </w:pPr>
+      <w:r>
+        <w:rPr/>
+      </w:r>
+    </w:p>
+    <w:p>
+      <w:pPr>
+        <w:pStyle w:val="Normal"/>
+        <w:spacing w:before="0" w:after="60"/>
+        <w:ind w:hanging="317" w:left="317"/>
+        <w:rPr>
+          <w:color w:val="000000"/>
+          <w:sz w:val="18"/>
+        </w:rPr>
+      </w:pPr>
+      <w:r>
+        <w:rPr/>
+      </w:r>
+    </w:p>
+    <w:p>
+      <w:pPr>
+        <w:pStyle w:val="Normal"/>
+        <w:spacing w:before="0" w:after="60"/>
+        <w:ind w:hanging="317" w:left="317"/>
+        <w:rPr>
+          <w:color w:val="000000"/>
+          <w:sz w:val="18"/>
+        </w:rPr>
+      </w:pPr>
+      <w:r>
+        <w:rPr/>
+      </w:r>
+    </w:p>
+    <w:p>
+      <w:pPr>
+        <w:pStyle w:val="Title"/>
+        <w:jc w:val="left"/>
+        <w:rPr/>
+      </w:pPr>
+      <w:r>
+        <w:rPr>
+          <w:rFonts w:ascii="Arial" w:hAnsi="Arial"/>
+          <w:b/>
+          <w:color w:val="000000"/>
+          <w:sz w:val="46"/>
+        </w:rPr>
+        <w:t xml:space="preserve">Week </w:t>
+      </w:r>
+      <w:r>
+        <w:rPr>
+          <w:rFonts w:ascii="Arial" w:hAnsi="Arial"/>
+          <w:b/>
+          <w:color w:val="000000"/>
+          <w:sz w:val="46"/>
+        </w:rPr>
+        <w:t>2</w:t>
+      </w:r>
+      <w:r>
+        <w:rPr>
+          <w:rFonts w:ascii="Arial" w:hAnsi="Arial"/>
+          <w:b/>
+          <w:color w:val="000000"/>
+          <w:sz w:val="46"/>
+        </w:rPr>
+        <w:t xml:space="preserve">: miRNA-mRNA human – chimp brain development </w:t>
+      </w:r>
+    </w:p>
+    <w:p>
+      <w:pPr>
+        <w:pStyle w:val="Normal"/>
+        <w:jc w:val="left"/>
+        <w:rPr>
+          <w:rFonts w:ascii="Arial" w:hAnsi="Arial"/>
+          <w:b/>
+          <w:color w:val="000000"/>
+          <w:sz w:val="46"/>
+        </w:rPr>
+      </w:pPr>
+      <w:r>
+        <w:rPr/>
+      </w:r>
+    </w:p>
+    <w:p>
+      <w:pPr>
+        <w:pStyle w:val="Normal"/>
+        <w:spacing w:before="0" w:after="120"/>
+        <w:jc w:val="left"/>
+        <w:rPr>
+          <w:rFonts w:ascii="Arial" w:hAnsi="Arial"/>
+          <w:b/>
+          <w:color w:val="000000"/>
+          <w:sz w:val="46"/>
+        </w:rPr>
+      </w:pPr>
+      <w:r>
+        <w:rPr/>
       </w:r>
     </w:p>
     <w:sectPr>
-      <w:footerReference w:type="even" r:id="rId2"/>
-      <w:footerReference w:type="default" r:id="rId3"/>
-      <w:footerReference w:type="first" r:id="rId4"/>
+      <w:footerReference w:type="even" r:id="rId4"/>
+      <w:footerReference w:type="default" r:id="rId5"/>
+      <w:footerReference w:type="first" r:id="rId6"/>
       <w:type w:val="nextPage"/>
       <w:pgSz w:w="12240" w:h="15840"/>
       <w:pgMar w:left="1123" w:right="1123" w:gutter="0" w:header="0" w:top="1037" w:footer="720" w:bottom="979"/>
@@ -2784,6 +2989,232 @@
   <w:abstractNum w:abstractNumId="9">
     <w:lvl w:ilvl="0">
       <w:start w:val="1"/>
+      <w:numFmt w:val="bullet"/>
+      <w:lvlText w:val=""/>
+      <w:lvlJc w:val="left"/>
+      <w:pPr>
+        <w:tabs>
+          <w:tab w:val="num" w:pos="720"/>
+        </w:tabs>
+        <w:ind w:left="720" w:hanging="283"/>
+      </w:pPr>
+      <w:rPr>
+        <w:rFonts w:ascii="Symbol" w:hAnsi="Symbol" w:cs="Symbol" w:hint="default"/>
+      </w:rPr>
+    </w:lvl>
+    <w:lvl w:ilvl="1">
+      <w:start w:val="1"/>
+      <w:numFmt w:val="decimal"/>
+      <w:lvlText w:val="%2."/>
+      <w:lvlJc w:val="left"/>
+      <w:pPr>
+        <w:tabs>
+          <w:tab w:val="num" w:pos="1080"/>
+        </w:tabs>
+        <w:ind w:left="1080" w:hanging="360"/>
+      </w:pPr>
+    </w:lvl>
+    <w:lvl w:ilvl="2">
+      <w:start w:val="1"/>
+      <w:numFmt w:val="decimal"/>
+      <w:lvlText w:val="%3."/>
+      <w:lvlJc w:val="left"/>
+      <w:pPr>
+        <w:tabs>
+          <w:tab w:val="num" w:pos="1440"/>
+        </w:tabs>
+        <w:ind w:left="1440" w:hanging="360"/>
+      </w:pPr>
+    </w:lvl>
+    <w:lvl w:ilvl="3">
+      <w:start w:val="1"/>
+      <w:numFmt w:val="decimal"/>
+      <w:lvlText w:val="%4."/>
+      <w:lvlJc w:val="left"/>
+      <w:pPr>
+        <w:tabs>
+          <w:tab w:val="num" w:pos="1800"/>
+        </w:tabs>
+        <w:ind w:left="1800" w:hanging="360"/>
+      </w:pPr>
+    </w:lvl>
+    <w:lvl w:ilvl="4">
+      <w:start w:val="1"/>
+      <w:numFmt w:val="decimal"/>
+      <w:lvlText w:val="%5."/>
+      <w:lvlJc w:val="left"/>
+      <w:pPr>
+        <w:tabs>
+          <w:tab w:val="num" w:pos="2160"/>
+        </w:tabs>
+        <w:ind w:left="2160" w:hanging="360"/>
+      </w:pPr>
+    </w:lvl>
+    <w:lvl w:ilvl="5">
+      <w:start w:val="1"/>
+      <w:numFmt w:val="decimal"/>
+      <w:lvlText w:val="%6."/>
+      <w:lvlJc w:val="left"/>
+      <w:pPr>
+        <w:tabs>
+          <w:tab w:val="num" w:pos="2520"/>
+        </w:tabs>
+        <w:ind w:left="2520" w:hanging="360"/>
+      </w:pPr>
+    </w:lvl>
+    <w:lvl w:ilvl="6">
+      <w:start w:val="1"/>
+      <w:numFmt w:val="decimal"/>
+      <w:lvlText w:val="%7."/>
+      <w:lvlJc w:val="left"/>
+      <w:pPr>
+        <w:tabs>
+          <w:tab w:val="num" w:pos="2880"/>
+        </w:tabs>
+        <w:ind w:left="2880" w:hanging="360"/>
+      </w:pPr>
+    </w:lvl>
+    <w:lvl w:ilvl="7">
+      <w:start w:val="1"/>
+      <w:numFmt w:val="decimal"/>
+      <w:lvlText w:val="%8."/>
+      <w:lvlJc w:val="left"/>
+      <w:pPr>
+        <w:tabs>
+          <w:tab w:val="num" w:pos="3240"/>
+        </w:tabs>
+        <w:ind w:left="3240" w:hanging="360"/>
+      </w:pPr>
+    </w:lvl>
+    <w:lvl w:ilvl="8">
+      <w:start w:val="1"/>
+      <w:numFmt w:val="decimal"/>
+      <w:lvlText w:val="%9."/>
+      <w:lvlJc w:val="left"/>
+      <w:pPr>
+        <w:tabs>
+          <w:tab w:val="num" w:pos="3600"/>
+        </w:tabs>
+        <w:ind w:left="3600" w:hanging="360"/>
+      </w:pPr>
+    </w:lvl>
+  </w:abstractNum>
+  <w:abstractNum w:abstractNumId="10">
+    <w:lvl w:ilvl="0">
+      <w:start w:val="1"/>
+      <w:numFmt w:val="bullet"/>
+      <w:lvlText w:val=""/>
+      <w:lvlJc w:val="left"/>
+      <w:pPr>
+        <w:tabs>
+          <w:tab w:val="num" w:pos="720"/>
+        </w:tabs>
+        <w:ind w:left="720" w:hanging="283"/>
+      </w:pPr>
+      <w:rPr>
+        <w:rFonts w:ascii="Symbol" w:hAnsi="Symbol" w:cs="Symbol" w:hint="default"/>
+      </w:rPr>
+    </w:lvl>
+    <w:lvl w:ilvl="1">
+      <w:start w:val="1"/>
+      <w:numFmt w:val="decimal"/>
+      <w:lvlText w:val="%2."/>
+      <w:lvlJc w:val="left"/>
+      <w:pPr>
+        <w:tabs>
+          <w:tab w:val="num" w:pos="1080"/>
+        </w:tabs>
+        <w:ind w:left="1080" w:hanging="360"/>
+      </w:pPr>
+    </w:lvl>
+    <w:lvl w:ilvl="2">
+      <w:start w:val="1"/>
+      <w:numFmt w:val="decimal"/>
+      <w:lvlText w:val="%3."/>
+      <w:lvlJc w:val="left"/>
+      <w:pPr>
+        <w:tabs>
+          <w:tab w:val="num" w:pos="1440"/>
+        </w:tabs>
+        <w:ind w:left="1440" w:hanging="360"/>
+      </w:pPr>
+    </w:lvl>
+    <w:lvl w:ilvl="3">
+      <w:start w:val="1"/>
+      <w:numFmt w:val="decimal"/>
+      <w:lvlText w:val="%4."/>
+      <w:lvlJc w:val="left"/>
+      <w:pPr>
+        <w:tabs>
+          <w:tab w:val="num" w:pos="1800"/>
+        </w:tabs>
+        <w:ind w:left="1800" w:hanging="360"/>
+      </w:pPr>
+    </w:lvl>
+    <w:lvl w:ilvl="4">
+      <w:start w:val="1"/>
+      <w:numFmt w:val="decimal"/>
+      <w:lvlText w:val="%5."/>
+      <w:lvlJc w:val="left"/>
+      <w:pPr>
+        <w:tabs>
+          <w:tab w:val="num" w:pos="2160"/>
+        </w:tabs>
+        <w:ind w:left="2160" w:hanging="360"/>
+      </w:pPr>
+    </w:lvl>
+    <w:lvl w:ilvl="5">
+      <w:start w:val="1"/>
+      <w:numFmt w:val="decimal"/>
+      <w:lvlText w:val="%6."/>
+      <w:lvlJc w:val="left"/>
+      <w:pPr>
+        <w:tabs>
+          <w:tab w:val="num" w:pos="2520"/>
+        </w:tabs>
+        <w:ind w:left="2520" w:hanging="360"/>
+      </w:pPr>
+    </w:lvl>
+    <w:lvl w:ilvl="6">
+      <w:start w:val="1"/>
+      <w:numFmt w:val="decimal"/>
+      <w:lvlText w:val="%7."/>
+      <w:lvlJc w:val="left"/>
+      <w:pPr>
+        <w:tabs>
+          <w:tab w:val="num" w:pos="2880"/>
+        </w:tabs>
+        <w:ind w:left="2880" w:hanging="360"/>
+      </w:pPr>
+    </w:lvl>
+    <w:lvl w:ilvl="7">
+      <w:start w:val="1"/>
+      <w:numFmt w:val="decimal"/>
+      <w:lvlText w:val="%8."/>
+      <w:lvlJc w:val="left"/>
+      <w:pPr>
+        <w:tabs>
+          <w:tab w:val="num" w:pos="3240"/>
+        </w:tabs>
+        <w:ind w:left="3240" w:hanging="360"/>
+      </w:pPr>
+    </w:lvl>
+    <w:lvl w:ilvl="8">
+      <w:start w:val="1"/>
+      <w:numFmt w:val="decimal"/>
+      <w:lvlText w:val="%9."/>
+      <w:lvlJc w:val="left"/>
+      <w:pPr>
+        <w:tabs>
+          <w:tab w:val="num" w:pos="3600"/>
+        </w:tabs>
+        <w:ind w:left="3600" w:hanging="360"/>
+      </w:pPr>
+    </w:lvl>
+  </w:abstractNum>
+  <w:abstractNum w:abstractNumId="11">
+    <w:lvl w:ilvl="0">
+      <w:start w:val="1"/>
       <w:numFmt w:val="none"/>
       <w:suff w:val="nothing"/>
       <w:lvlText w:val=""/>
@@ -2926,6 +3357,12 @@
   </w:num>
   <w:num w:numId="9">
     <w:abstractNumId w:val="9"/>
+  </w:num>
+  <w:num w:numId="10">
+    <w:abstractNumId w:val="10"/>
+  </w:num>
+  <w:num w:numId="11">
+    <w:abstractNumId w:val="11"/>
   </w:num>
 </w:numbering>
 </file>
@@ -3680,6 +4117,20 @@
     <w:qFormat/>
     <w:rPr>
       <w:rFonts w:ascii="OpenSymbol" w:hAnsi="OpenSymbol" w:eastAsia="OpenSymbol" w:cs="OpenSymbol"/>
+    </w:rPr>
+  </w:style>
+  <w:style w:type="character" w:styleId="SourceText">
+    <w:name w:val="Source Text"/>
+    <w:qFormat/>
+    <w:rPr>
+      <w:rFonts w:ascii="Liberation Mono" w:hAnsi="Liberation Mono" w:eastAsia="Liberation Mono" w:cs="Liberation Mono"/>
+    </w:rPr>
+  </w:style>
+  <w:style w:type="character" w:styleId="Hyperlink">
+    <w:name w:val="Hyperlink"/>
+    <w:rPr>
+      <w:color w:val="000080"/>
+      <w:u w:val="single"/>
     </w:rPr>
   </w:style>
   <w:style w:type="paragraph" w:styleId="Heading">

</xml_diff>